<commit_message>
insert flowchart into prereg protocol
</commit_message>
<xml_diff>
--- a/preregistration/package/00_protocol/Validation_Protocol_PreReg_v0.11.docx
+++ b/preregistration/package/00_protocol/Validation_Protocol_PreReg_v0.11.docx
@@ -465,6 +465,65 @@
           <w:rtl w:val="0"/>
         </w:rPr>
         <w:t xml:space="preserve">This section summarises the design and reports model-behaviour analyses completed and inspected before registration. They are therefore treated as pre-existing descriptive and design information. The formal human-validation phase is prospective: no active validation or reserve sample had been drawn and no formal validation coding data existed at registration. Shared coder training and the 10-record pilot had been completed before registration using only records in the frozen exclusion set. These activities are treated as training and instrument-development work rather than formal validation evidence. </w:t>
+      </w:r>
+    </w:p>
+    <w:p>
+      <w:pPr>
+        <w:widowControl w:val="1"/>
+        <w:rPr/>
+      </w:pPr>
+      <w:r>
+        <w:rPr/>
+        <w:drawing>
+          <wp:inline distB="114300" distT="114300" distL="114300" distR="114300">
+            <wp:extent cx="6746756" cy="3494723"/>
+            <wp:effectExtent b="0" l="0" r="0" t="0"/>
+            <wp:docPr id="1" name="image1.png"/>
+            <a:graphic>
+              <a:graphicData uri="http://schemas.openxmlformats.org/drawingml/2006/picture">
+                <pic:pic>
+                  <pic:nvPicPr>
+                    <pic:cNvPr id="0" name="image1.png"/>
+                    <pic:cNvPicPr preferRelativeResize="0"/>
+                  </pic:nvPicPr>
+                  <pic:blipFill>
+                    <a:blip r:embed="rId7"/>
+                    <a:srcRect b="0" l="0" r="0" t="0"/>
+                    <a:stretch>
+                      <a:fillRect/>
+                    </a:stretch>
+                  </pic:blipFill>
+                  <pic:spPr>
+                    <a:xfrm>
+                      <a:off x="0" y="0"/>
+                      <a:ext cx="6746756" cy="3494723"/>
+                    </a:xfrm>
+                    <a:prstGeom prst="rect"/>
+                    <a:ln/>
+                  </pic:spPr>
+                </pic:pic>
+              </a:graphicData>
+            </a:graphic>
+          </wp:inline>
+        </w:drawing>
+      </w:r>
+      <w:r>
+        <w:rPr>
+          <w:rtl w:val="0"/>
+        </w:rPr>
+      </w:r>
+    </w:p>
+    <w:p>
+      <w:pPr>
+        <w:pStyle w:val="Heading2"/>
+        <w:keepNext w:val="1"/>
+        <w:widowControl w:val="1"/>
+        <w:rPr/>
+      </w:pPr>
+      <w:r>
+        <w:rPr>
+          <w:rtl w:val="0"/>
+        </w:rPr>
       </w:r>
     </w:p>
     <w:p>
@@ -2076,19 +2135,55 @@
         <w:rPr>
           <w:rtl w:val="0"/>
         </w:rPr>
-        <w:t xml:space="preserve">All component alphas and differences will be reported alongside delta_min. The minimum is deliberately conservative and, as the minimum of correlated estimates, may be downward biased; interpretation therefore uses the bootstrap interval for delta_min, recalculated jointly with the component alphas and differences within each resample, and the broader evidence profile rather than the point estimate alone.</w:t>
-      </w:r>
-    </w:p>
-    <w:p>
-      <w:pPr>
-        <w:widowControl w:val="1"/>
-        <w:rPr/>
-      </w:pPr>
-      <w:r>
-        <w:rPr>
-          <w:rtl w:val="0"/>
-        </w:rPr>
-        <w:t xml:space="preserve">For each binary tag, the replacement-panel analysis will use nominal distance. Additional prevalence-sensitive diagnostics are defined in Section 8.4, and the two tags will be analysed separately.</w:t>
+        <w:t xml:space="preserve">All component alphas and differences will be reported alongside delta_min. The replacement differences quantify changes in the reliability of the three-member panel when the production model replaces a particular coder. They should not be interpreted as direct measures of model accuracy or as intrinsic properties of the model independent of the remaining panel members. </w:t>
+      </w:r>
+    </w:p>
+    <w:p>
+      <w:pPr>
+        <w:widowControl w:val="1"/>
+        <w:rPr/>
+      </w:pPr>
+      <w:r>
+        <w:rPr>
+          <w:rtl w:val="0"/>
+        </w:rPr>
+        <w:t xml:space="preserve">The delta_min is the minimum of three noisy and correlated estimates; it is subject to negative selection bias relative to the minimum of the corresponding population differences. Its sampling distribution may also be non-smooth when two or more component differences are similar. Interpretation will therefore consider the full set of component alphas and differences rather than delta_min alone.</w:t>
+      </w:r>
+    </w:p>
+    <w:p>
+      <w:pPr>
+        <w:widowControl w:val="1"/>
+        <w:rPr/>
+      </w:pPr>
+      <w:r>
+        <w:rPr>
+          <w:rtl w:val="0"/>
+        </w:rPr>
+        <w:t xml:space="preserve">Interpretation therefore uses the bootstrap interval for delta_min, recalculated jointly with the component alphas and differences within each resample, and the broader evidence profile rather than the point estimate alone.</w:t>
+      </w:r>
+    </w:p>
+    <w:p>
+      <w:pPr>
+        <w:widowControl w:val="1"/>
+        <w:rPr/>
+      </w:pPr>
+      <w:r>
+        <w:rPr>
+          <w:rtl w:val="0"/>
+        </w:rPr>
+        <w:t xml:space="preserve">For each binary tag, the replacement-panel analysis will use nominal distance. Additional prevalence-sensitive diagnostics are defined in Section 8.4, and the two tags will be analysed </w:t>
+      </w:r>
+      <w:r>
+        <w:rPr>
+          <w:rtl w:val="0"/>
+        </w:rPr>
+        <w:t xml:space="preserve">separately</w:t>
+      </w:r>
+      <w:r>
+        <w:rPr>
+          <w:rtl w:val="0"/>
+        </w:rPr>
+        <w:t xml:space="preserve">.</w:t>
       </w:r>
     </w:p>
     <w:p>
@@ -3528,7 +3623,7 @@
         <w:rPr>
           <w:rtl w:val="0"/>
         </w:rPr>
-        <w:t xml:space="preserve">Material degradation asks whether substituting the production model for one trained coder meaningfully lowers panel agreement relative to the all-human panel. It is assessed from the direction, magnitude, and uncertainty of the replacement differences together with diagnostic evidence about recurring causes, rather than by one numerical threshold.</w:t>
+        <w:t xml:space="preserve">Material degradation asks whether substituting the production model for one trained coder meaningfully lowers panel agreement relative to the all-human panel. It is assessed from the direction, magnitude, and uncertainty of the replacement differences together with diagnostic evidence about recurring causes, rather than by one numerical threshold. Accordingly, no fixed magnitude of replacement-alpha difference is pre-designated as acceptable or unacceptable; the release decision rests on the direction and statistical compatibility of the differences (Section 10.2, triggers 1–2), the adjudicated source of the disagreements, and the signed review of Section 10.7. </w:t>
       </w:r>
     </w:p>
     <w:p>

</xml_diff>